<commit_message>
adjusting planner- wrote Readme for instance 1.2
</commit_message>
<xml_diff>
--- a/Notes-Assignment.docx
+++ b/Notes-Assignment.docx
@@ -26,19 +26,7 @@
           <w:rPr>
             <w:rStyle w:val="Hyperlink"/>
           </w:rPr>
-          <w:t>Moving sound source localization base</w:t>
-        </w:r>
-        <w:r>
-          <w:rPr>
-            <w:rStyle w:val="Hyperlink"/>
-          </w:rPr>
-          <w:t>d</w:t>
-        </w:r>
-        <w:r>
-          <w:rPr>
-            <w:rStyle w:val="Hyperlink"/>
-          </w:rPr>
-          <w:t xml:space="preserve"> on triangulation method - ScienceDirect</w:t>
+          <w:t>Moving sound source localization based on triangulation method - ScienceDirect</w:t>
         </w:r>
       </w:hyperlink>
     </w:p>
@@ -47,21 +35,7 @@
         <w:rPr>
           <w:lang w:val="en-US"/>
         </w:rPr>
-        <w:t xml:space="preserve">With regards to how the predicates in the visualizer become true/false. With respect to microphones. </w:t>
-      </w:r>
-      <w:proofErr w:type="gramStart"/>
-      <w:r>
-        <w:rPr>
-          <w:lang w:val="en-US"/>
-        </w:rPr>
-        <w:t>So</w:t>
-      </w:r>
-      <w:proofErr w:type="gramEnd"/>
-      <w:r>
-        <w:rPr>
-          <w:lang w:val="en-US"/>
-        </w:rPr>
-        <w:t xml:space="preserve"> we can use </w:t>
+        <w:t xml:space="preserve">With regards to how the predicates in the visualizer become true/false. With respect to microphones. So we can use </w:t>
       </w:r>
       <w:r>
         <w:rPr>
@@ -73,21 +47,7 @@
         <w:rPr>
           <w:lang w:val="en-US"/>
         </w:rPr>
-        <w:t>uses the de-</w:t>
-      </w:r>
-      <w:proofErr w:type="spellStart"/>
-      <w:r>
-        <w:rPr>
-          <w:lang w:val="en-US"/>
-        </w:rPr>
-        <w:t>dopplerized</w:t>
-      </w:r>
-      <w:proofErr w:type="spellEnd"/>
-      <w:r>
-        <w:rPr>
-          <w:lang w:val="en-US"/>
-        </w:rPr>
-        <w:t xml:space="preserve"> signals (which </w:t>
+        <w:t xml:space="preserve">uses the de-dopplerized signals (which </w:t>
       </w:r>
       <w:r>
         <w:t xml:space="preserve">refers to the processes, algorithms, and techniques used to </w:t>
@@ -117,13 +77,8 @@
       </w:r>
     </w:p>
     <w:p>
-      <w:proofErr w:type="gramStart"/>
-      <w:r>
-        <w:t>So</w:t>
-      </w:r>
-      <w:proofErr w:type="gramEnd"/>
-      <w:r>
-        <w:t xml:space="preserve"> </w:t>
+      <w:r>
+        <w:t xml:space="preserve">So </w:t>
       </w:r>
       <w:r>
         <w:t xml:space="preserve">using the </w:t>
@@ -145,6 +100,14 @@
       </w:r>
       <w:r>
         <w:t xml:space="preserve">sound pressure. </w:t>
+      </w:r>
+    </w:p>
+    <w:p>
+      <w:r>
+        <w:t xml:space="preserve">It also takes into account the echos of sounds and warps that into calculations which </w:t>
+      </w:r>
+      <w:r>
+        <w:t xml:space="preserve">diverege the system </w:t>
       </w:r>
     </w:p>
     <w:p>
@@ -296,6 +259,168 @@
     </w:p>
     <w:p>
       <w:pPr>
+        <w:pStyle w:val="ListParagraph"/>
+        <w:numPr>
+          <w:ilvl w:val="0"/>
+          <w:numId w:val="9"/>
+        </w:numPr>
+        <w:rPr>
+          <w:lang w:val="en-US"/>
+        </w:rPr>
+      </w:pPr>
+      <w:r>
+        <w:rPr>
+          <w:lang w:val="en-US"/>
+        </w:rPr>
+        <w:t xml:space="preserve">Tries to balance the noise between the </w:t>
+      </w:r>
+      <w:r>
+        <w:rPr>
+          <w:lang w:val="en-US"/>
+        </w:rPr>
+        <w:t>microphones</w:t>
+      </w:r>
+      <w:r>
+        <w:rPr>
+          <w:lang w:val="en-US"/>
+        </w:rPr>
+        <w:t xml:space="preserve"> </w:t>
+      </w:r>
+    </w:p>
+    <w:p>
+      <w:pPr>
+        <w:pStyle w:val="ListParagraph"/>
+        <w:numPr>
+          <w:ilvl w:val="0"/>
+          <w:numId w:val="9"/>
+        </w:numPr>
+        <w:rPr>
+          <w:lang w:val="en-US"/>
+        </w:rPr>
+      </w:pPr>
+      <w:r>
+        <w:rPr>
+          <w:lang w:val="en-US"/>
+        </w:rPr>
+        <w:t xml:space="preserve">While due to </w:t>
+      </w:r>
+      <w:r>
+        <w:rPr>
+          <w:lang w:val="en-US"/>
+        </w:rPr>
+        <w:t>echoes</w:t>
+      </w:r>
+      <w:r>
+        <w:rPr>
+          <w:lang w:val="en-US"/>
+        </w:rPr>
+        <w:t xml:space="preserve"> only lasting a few seconds </w:t>
+      </w:r>
+      <w:r>
+        <w:rPr>
+          <w:lang w:val="en-US"/>
+        </w:rPr>
+        <w:t xml:space="preserve">and the heavy mass and inertia of the robot </w:t>
+      </w:r>
+      <w:r>
+        <w:rPr>
+          <w:lang w:val="en-US"/>
+        </w:rPr>
+        <w:t xml:space="preserve">the ultimate / long lasting effect of that echo is minuscule </w:t>
+      </w:r>
+    </w:p>
+    <w:p>
+      <w:pPr>
+        <w:pStyle w:val="ListParagraph"/>
+        <w:numPr>
+          <w:ilvl w:val="0"/>
+          <w:numId w:val="9"/>
+        </w:numPr>
+        <w:rPr>
+          <w:lang w:val="en-US"/>
+        </w:rPr>
+      </w:pPr>
+      <w:r>
+        <w:rPr>
+          <w:lang w:val="en-US"/>
+        </w:rPr>
+        <w:t>Sound</w:t>
+      </w:r>
+      <w:r>
+        <w:rPr>
+          <w:lang w:val="en-US"/>
+        </w:rPr>
+        <w:t>, both echoes and actual noise generation,</w:t>
+      </w:r>
+      <w:r>
+        <w:rPr>
+          <w:lang w:val="en-US"/>
+        </w:rPr>
+        <w:t xml:space="preserve"> further away from the </w:t>
+      </w:r>
+      <w:r>
+        <w:rPr>
+          <w:lang w:val="en-US"/>
+        </w:rPr>
+        <w:t xml:space="preserve">robot generate roughly the same dB . However, as the robot approaches the generated noise, the dB from the </w:t>
+      </w:r>
+      <w:r>
+        <w:rPr>
+          <w:lang w:val="en-US"/>
+        </w:rPr>
+        <w:t xml:space="preserve">object </w:t>
+      </w:r>
+      <w:r>
+        <w:rPr>
+          <w:lang w:val="en-US"/>
+        </w:rPr>
+        <w:t>grow exponentially</w:t>
+      </w:r>
+      <w:r>
+        <w:rPr>
+          <w:lang w:val="en-US"/>
+        </w:rPr>
+        <w:t xml:space="preserve"> louder than the echoes</w:t>
+      </w:r>
+      <w:r>
+        <w:rPr>
+          <w:lang w:val="en-US"/>
+        </w:rPr>
+        <w:t xml:space="preserve">. </w:t>
+      </w:r>
+      <w:r>
+        <w:rPr>
+          <w:lang w:val="en-US"/>
+        </w:rPr>
+        <w:t>Therefore, the direct signal natural overwhelms the system leading the robot to the correct direction</w:t>
+      </w:r>
+      <w:r>
+        <w:rPr>
+          <w:lang w:val="en-US"/>
+        </w:rPr>
+        <w:t xml:space="preserve">. </w:t>
+      </w:r>
+    </w:p>
+    <w:p>
+      <w:pPr>
+        <w:pStyle w:val="ListParagraph"/>
+        <w:numPr>
+          <w:ilvl w:val="0"/>
+          <w:numId w:val="9"/>
+        </w:numPr>
+        <w:rPr>
+          <w:lang w:val="en-US"/>
+        </w:rPr>
+      </w:pPr>
+      <w:r>
+        <w:rPr>
+          <w:lang w:val="en-US"/>
+        </w:rPr>
+        <w:t>Follows gradient of sound waves</w:t>
+      </w:r>
+    </w:p>
+    <w:p>
+      <w:pPr>
         <w:rPr>
           <w:lang w:val="en-US"/>
         </w:rPr>
@@ -312,21 +437,7 @@
           <w:rPr>
             <w:rStyle w:val="Hyperlink"/>
           </w:rPr>
-          <w:t xml:space="preserve">Sound Source Localization and Detection Methods | </w:t>
-        </w:r>
-        <w:proofErr w:type="spellStart"/>
-        <w:r>
-          <w:rPr>
-            <w:rStyle w:val="Hyperlink"/>
-          </w:rPr>
-          <w:t>Encyclopedia</w:t>
-        </w:r>
-        <w:proofErr w:type="spellEnd"/>
-        <w:r>
-          <w:rPr>
-            <w:rStyle w:val="Hyperlink"/>
-          </w:rPr>
-          <w:t xml:space="preserve"> MDPI</w:t>
+          <w:t>Sound Source Localization and Detection Methods | Encyclopedia MDPI</w:t>
         </w:r>
       </w:hyperlink>
     </w:p>
@@ -378,15 +489,7 @@
         <w:t>]</w:t>
       </w:r>
       <w:r>
-        <w:t xml:space="preserve">. Localizing a moving sound source using the </w:t>
-      </w:r>
-      <w:proofErr w:type="spellStart"/>
-      <w:r>
-        <w:t>TDoA</w:t>
-      </w:r>
-      <w:proofErr w:type="spellEnd"/>
-      <w:r>
-        <w:t xml:space="preserve"> method is a problem due to the Doppler effect</w:t>
+        <w:t>. Localizing a moving sound source using the TDoA method is a problem due to the Doppler effect</w:t>
       </w:r>
     </w:p>
     <w:p>
@@ -427,16 +530,8 @@
           <w:rPr>
             <w:rStyle w:val="Hyperlink"/>
           </w:rPr>
-          <w:t xml:space="preserve">Firefighter Search and Rescue Techniques | </w:t>
+          <w:t>Firefighter Search and Rescue Techniques | BlowHard</w:t>
         </w:r>
-        <w:proofErr w:type="spellStart"/>
-        <w:r>
-          <w:rPr>
-            <w:rStyle w:val="Hyperlink"/>
-          </w:rPr>
-          <w:t>BlowHard</w:t>
-        </w:r>
-        <w:proofErr w:type="spellEnd"/>
       </w:hyperlink>
     </w:p>
     <w:p>
@@ -489,7 +584,6 @@
         </w:rPr>
       </w:pPr>
       <w:r>
-        <w:lastRenderedPageBreak/>
         <w:t>Soft Miniaturised Underground Robotic Finder (SMURF).</w:t>
       </w:r>
     </w:p>
@@ -658,6 +752,32 @@
           <w:lang w:val="en-US"/>
         </w:rPr>
       </w:pPr>
+      <w:hyperlink r:id="rId14" w:history="1">
+        <w:r>
+          <w:rPr>
+            <w:rStyle w:val="Hyperlink"/>
+          </w:rPr>
+          <w:t>Sniffer, a protein-based advanced VOC sensor for victim search.pdf</w:t>
+        </w:r>
+      </w:hyperlink>
+    </w:p>
+    <w:p>
+      <w:pPr>
+        <w:pStyle w:val="ListParagraph"/>
+        <w:numPr>
+          <w:ilvl w:val="0"/>
+          <w:numId w:val="9"/>
+        </w:numPr>
+        <w:rPr>
+          <w:lang w:val="en-US"/>
+        </w:rPr>
+      </w:pPr>
+      <w:r>
+        <w:rPr>
+          <w:lang w:val="en-US"/>
+        </w:rPr>
+        <w:t>How the technology actually works</w:t>
+      </w:r>
     </w:p>
     <w:p>
       <w:pPr>
@@ -690,7 +810,7 @@
           <w:lang w:val="en-US"/>
         </w:rPr>
       </w:pPr>
-      <w:hyperlink r:id="rId14" w:history="1">
+      <w:hyperlink r:id="rId15" w:history="1">
         <w:r>
           <w:rPr>
             <w:rStyle w:val="Hyperlink"/>
@@ -750,21 +870,7 @@
         <w:rPr>
           <w:lang w:val="en-US"/>
         </w:rPr>
-        <w:t xml:space="preserve">Don’t remove rubble </w:t>
-      </w:r>
-      <w:proofErr w:type="gramStart"/>
-      <w:r>
-        <w:rPr>
-          <w:lang w:val="en-US"/>
-        </w:rPr>
-        <w:t>to</w:t>
-      </w:r>
-      <w:proofErr w:type="gramEnd"/>
-      <w:r>
-        <w:rPr>
-          <w:lang w:val="en-US"/>
-        </w:rPr>
-        <w:t xml:space="preserve"> quickly </w:t>
+        <w:t xml:space="preserve">Don’t remove rubble to quickly </w:t>
       </w:r>
     </w:p>
     <w:p>
@@ -812,21 +918,7 @@
         <w:rPr>
           <w:lang w:val="en-US"/>
         </w:rPr>
-        <w:t xml:space="preserve">debris to move again which causes harm to the </w:t>
-      </w:r>
-      <w:proofErr w:type="gramStart"/>
-      <w:r>
-        <w:rPr>
-          <w:lang w:val="en-US"/>
-        </w:rPr>
-        <w:t>rescuer</w:t>
-      </w:r>
-      <w:proofErr w:type="gramEnd"/>
-      <w:r>
-        <w:rPr>
-          <w:lang w:val="en-US"/>
-        </w:rPr>
-        <w:t xml:space="preserve"> and the victims</w:t>
+        <w:t>debris to move again which causes harm to the rescuer and the victims</w:t>
       </w:r>
     </w:p>
     <w:p>
@@ -848,35 +940,6 @@
         </w:rPr>
         <w:t>Robots using AI:</w:t>
       </w:r>
-    </w:p>
-    <w:p>
-      <w:pPr>
-        <w:rPr>
-          <w:lang w:val="en-US"/>
-        </w:rPr>
-      </w:pPr>
-      <w:hyperlink r:id="rId15" w:history="1">
-        <w:r>
-          <w:rPr>
-            <w:rStyle w:val="Hyperlink"/>
-          </w:rPr>
-          <w:t xml:space="preserve">All About Rescue Robots | </w:t>
-        </w:r>
-        <w:proofErr w:type="spellStart"/>
-        <w:r>
-          <w:rPr>
-            <w:rStyle w:val="Hyperlink"/>
-          </w:rPr>
-          <w:t>Amprius</w:t>
-        </w:r>
-        <w:proofErr w:type="spellEnd"/>
-        <w:r>
-          <w:rPr>
-            <w:rStyle w:val="Hyperlink"/>
-          </w:rPr>
-          <w:t xml:space="preserve"> Technologies</w:t>
-        </w:r>
-      </w:hyperlink>
     </w:p>
     <w:p>
       <w:pPr>
@@ -889,21 +952,22 @@
           <w:rPr>
             <w:rStyle w:val="Hyperlink"/>
           </w:rPr>
-          <w:t xml:space="preserve">How KNF Helped </w:t>
+          <w:t>All About Rescue Robots | Amprius Technologies</w:t>
         </w:r>
-        <w:proofErr w:type="gramStart"/>
+      </w:hyperlink>
+    </w:p>
+    <w:p>
+      <w:pPr>
+        <w:rPr>
+          <w:lang w:val="en-US"/>
+        </w:rPr>
+      </w:pPr>
+      <w:hyperlink r:id="rId17" w:history="1">
         <w:r>
           <w:rPr>
             <w:rStyle w:val="Hyperlink"/>
           </w:rPr>
-          <w:t>To</w:t>
-        </w:r>
-        <w:proofErr w:type="gramEnd"/>
-        <w:r>
-          <w:rPr>
-            <w:rStyle w:val="Hyperlink"/>
-          </w:rPr>
-          <w:t xml:space="preserve"> Develop a New Earthquake Rescue Robot | KNF</w:t>
+          <w:t>How KNF Helped To Develop a New Earthquake Rescue Robot | KNF</w:t>
         </w:r>
       </w:hyperlink>
     </w:p>
@@ -913,7 +977,7 @@
           <w:lang w:val="en-US"/>
         </w:rPr>
       </w:pPr>
-      <w:hyperlink r:id="rId17" w:history="1">
+      <w:hyperlink r:id="rId18" w:history="1">
         <w:r>
           <w:rPr>
             <w:rStyle w:val="Hyperlink"/>
@@ -961,6 +1025,7 @@
         <w:rPr>
           <w:lang w:val="en-US"/>
         </w:rPr>
+        <w:lastRenderedPageBreak/>
         <w:t xml:space="preserve">Increased safety- </w:t>
       </w:r>
       <w:r>
@@ -1015,18 +1080,10 @@
         <w:t>after snakes, which can glide through rubble and debris after earthquakes.</w:t>
       </w:r>
       <w:r>
-        <w:t xml:space="preserve"> – Developed by ETH </w:t>
-      </w:r>
-      <w:proofErr w:type="gramStart"/>
-      <w:r>
-        <w:t xml:space="preserve">using </w:t>
-      </w:r>
-      <w:r>
-        <w:t> long</w:t>
-      </w:r>
-      <w:proofErr w:type="gramEnd"/>
-      <w:r>
-        <w:t xml:space="preserve"> and twisted textile tube and a head that carries pneumatic steering actuators,</w:t>
+        <w:t xml:space="preserve"> – Developed by ETH using </w:t>
+      </w:r>
+      <w:r>
+        <w:t> long and twisted textile tube and a head that carries pneumatic steering actuators,</w:t>
       </w:r>
       <w:r>
         <w:t xml:space="preserve"> v</w:t>
@@ -1070,38 +1127,22 @@
           <w:lang w:val="en-US"/>
         </w:rPr>
       </w:pPr>
-      <w:hyperlink r:id="rId18" w:tgtFrame="_blank" w:history="1">
-        <w:proofErr w:type="spellStart"/>
+      <w:hyperlink r:id="rId19" w:tgtFrame="_blank" w:history="1">
         <w:r>
           <w:rPr>
             <w:rStyle w:val="Hyperlink"/>
           </w:rPr>
-          <w:t>Hyrodnalix’s</w:t>
-        </w:r>
-        <w:proofErr w:type="spellEnd"/>
-        <w:r>
-          <w:rPr>
-            <w:rStyle w:val="Hyperlink"/>
-          </w:rPr>
-          <w:t xml:space="preserve"> Emergency Integrated Lifesaving Lanyard</w:t>
+          <w:t>Hyrodnalix’s Emergency Integrated Lifesaving Lanyard</w:t>
         </w:r>
       </w:hyperlink>
       <w:r>
-        <w:t> (</w:t>
-      </w:r>
-      <w:proofErr w:type="gramStart"/>
-      <w:r>
-        <w:t>EMILY) </w:t>
+        <w:t> (EMILY) </w:t>
       </w:r>
       <w:r>
         <w:t xml:space="preserve"> </w:t>
       </w:r>
       <w:r>
-        <w:t>-</w:t>
-      </w:r>
-      <w:proofErr w:type="gramEnd"/>
-      <w:r>
-        <w:t xml:space="preserve"> </w:t>
+        <w:t xml:space="preserve">- </w:t>
       </w:r>
       <w:r>
         <w:t>air into the water and drive it to people who need rescuing</w:t>
@@ -1159,21 +1200,7 @@
         <w:rPr>
           <w:lang w:val="en-US"/>
         </w:rPr>
-        <w:t xml:space="preserve">Lack durability for long term use in disasters – needs to have a lot of </w:t>
-      </w:r>
-      <w:proofErr w:type="spellStart"/>
-      <w:r>
-        <w:rPr>
-          <w:lang w:val="en-US"/>
-        </w:rPr>
-        <w:t>maintance</w:t>
-      </w:r>
-      <w:proofErr w:type="spellEnd"/>
-      <w:r>
-        <w:rPr>
-          <w:lang w:val="en-US"/>
-        </w:rPr>
-        <w:t xml:space="preserve"> and access to maintenance and places need to have the correct repair kit</w:t>
+        <w:t>Lack durability for long term use in disasters – needs to have a lot of maintance and access to maintenance and places need to have the correct repair kit</w:t>
       </w:r>
     </w:p>
     <w:p>
@@ -1215,21 +1242,7 @@
         <w:rPr>
           <w:lang w:val="en-US"/>
         </w:rPr>
-        <w:t xml:space="preserve">Expensive to </w:t>
-      </w:r>
-      <w:proofErr w:type="gramStart"/>
-      <w:r>
-        <w:rPr>
-          <w:lang w:val="en-US"/>
-        </w:rPr>
-        <w:t>develop ,</w:t>
-      </w:r>
-      <w:proofErr w:type="gramEnd"/>
-      <w:r>
-        <w:rPr>
-          <w:lang w:val="en-US"/>
-        </w:rPr>
-        <w:t xml:space="preserve"> and maintain – particularly in lower income countries where this type of technology is not feasible</w:t>
+        <w:t>Expensive to develop , and maintain – particularly in lower income countries where this type of technology is not feasible</w:t>
       </w:r>
       <w:r>
         <w:rPr>
@@ -1311,7 +1324,7 @@
         </w:rPr>
         <w:br/>
       </w:r>
-      <w:hyperlink r:id="rId19" w:history="1">
+      <w:hyperlink r:id="rId20" w:history="1">
         <w:r>
           <w:rPr>
             <w:rStyle w:val="Hyperlink"/>
@@ -1339,82 +1352,40 @@
           <w:lang w:val="en-US"/>
         </w:rPr>
       </w:pPr>
-      <w:hyperlink r:id="rId20" w:history="1">
-        <w:r>
-          <w:rPr>
-            <w:rStyle w:val="Hyperlink"/>
-          </w:rPr>
-          <w:t xml:space="preserve">How Much Blood Loss is Fatal? The Critical Thresholds of </w:t>
-        </w:r>
-        <w:proofErr w:type="spellStart"/>
-        <w:r>
-          <w:rPr>
-            <w:rStyle w:val="Hyperlink"/>
-          </w:rPr>
-          <w:t>Hemorrhagic</w:t>
-        </w:r>
-        <w:proofErr w:type="spellEnd"/>
-        <w:r>
-          <w:rPr>
-            <w:rStyle w:val="Hyperlink"/>
-          </w:rPr>
-          <w:t xml:space="preserve"> S– MED-TAC International Corp.</w:t>
-        </w:r>
-      </w:hyperlink>
-    </w:p>
-    <w:p>
-      <w:pPr>
-        <w:rPr>
-          <w:lang w:val="en-US"/>
-        </w:rPr>
-      </w:pPr>
-      <w:r>
-        <w:rPr>
-          <w:lang w:val="en-US"/>
-        </w:rPr>
-        <w:t>Non-contact techniques for estimating vital signs:</w:t>
-      </w:r>
-    </w:p>
-    <w:p>
-      <w:pPr>
-        <w:rPr>
-          <w:lang w:val="en-US"/>
-        </w:rPr>
-      </w:pPr>
       <w:hyperlink r:id="rId21" w:history="1">
         <w:r>
           <w:rPr>
             <w:rStyle w:val="Hyperlink"/>
           </w:rPr>
-          <w:t xml:space="preserve">Contactless Vital Signs Monitoring </w:t>
+          <w:t>How Much Blood Loss is Fatal? The Critical Thresholds of Hemorrhagic S– MED-TAC International Corp.</w:t>
         </w:r>
-        <w:proofErr w:type="gramStart"/>
+      </w:hyperlink>
+    </w:p>
+    <w:p>
+      <w:pPr>
+        <w:rPr>
+          <w:lang w:val="en-US"/>
+        </w:rPr>
+      </w:pPr>
+      <w:r>
+        <w:rPr>
+          <w:lang w:val="en-US"/>
+        </w:rPr>
+        <w:t>Non-contact techniques for estimating vital signs:</w:t>
+      </w:r>
+    </w:p>
+    <w:p>
+      <w:pPr>
+        <w:rPr>
+          <w:lang w:val="en-US"/>
+        </w:rPr>
+      </w:pPr>
+      <w:hyperlink r:id="rId22" w:history="1">
         <w:r>
           <w:rPr>
             <w:rStyle w:val="Hyperlink"/>
           </w:rPr>
-          <w:t>From</w:t>
-        </w:r>
-        <w:proofErr w:type="gramEnd"/>
-        <w:r>
-          <w:rPr>
-            <w:rStyle w:val="Hyperlink"/>
-          </w:rPr>
-          <w:t xml:space="preserve"> Videos Recorded </w:t>
-        </w:r>
-        <w:proofErr w:type="gramStart"/>
-        <w:r>
-          <w:rPr>
-            <w:rStyle w:val="Hyperlink"/>
-          </w:rPr>
-          <w:t>With</w:t>
-        </w:r>
-        <w:proofErr w:type="gramEnd"/>
-        <w:r>
-          <w:rPr>
-            <w:rStyle w:val="Hyperlink"/>
-          </w:rPr>
-          <w:t xml:space="preserve"> Digital Cameras: An Overview - PMC</w:t>
+          <w:t>Contactless Vital Signs Monitoring From Videos Recorded With Digital Cameras: An Overview - PMC</w:t>
         </w:r>
       </w:hyperlink>
     </w:p>
@@ -1463,29 +1434,7 @@
         <w:rPr>
           <w:lang w:val="en-US"/>
         </w:rPr>
-        <w:t xml:space="preserve"> provide a good </w:t>
-      </w:r>
-      <w:proofErr w:type="spellStart"/>
-      <w:r>
-        <w:rPr>
-          <w:lang w:val="en-US"/>
-        </w:rPr>
-        <w:t xml:space="preserve">trade </w:t>
-      </w:r>
-      <w:proofErr w:type="gramStart"/>
-      <w:r>
-        <w:rPr>
-          <w:lang w:val="en-US"/>
-        </w:rPr>
-        <w:t>off</w:t>
-      </w:r>
-      <w:proofErr w:type="spellEnd"/>
-      <w:proofErr w:type="gramEnd"/>
-      <w:r>
-        <w:rPr>
-          <w:lang w:val="en-US"/>
-        </w:rPr>
-        <w:t xml:space="preserve"> between unobtrusiveness and sensitivity to cardiorespiratory changes- </w:t>
+        <w:t xml:space="preserve"> provide a good trade off between unobtrusiveness and sensitivity to cardiorespiratory changes- </w:t>
       </w:r>
     </w:p>
     <w:p>
@@ -1538,7 +1487,7 @@
           <w:lang w:val="en-US"/>
         </w:rPr>
       </w:pPr>
-      <w:hyperlink r:id="rId22" w:history="1">
+      <w:hyperlink r:id="rId23" w:history="1">
         <w:r>
           <w:rPr>
             <w:rStyle w:val="Hyperlink"/>
@@ -1589,15 +1538,7 @@
         </w:rPr>
       </w:pPr>
       <w:r>
-        <w:t>Thus, the detection of the breath is crucial for vital sign monitoring. The breath rate is detectable using contact-based and remote sensors such as electrocardiography, strain-based sensors, photoplethysmography, and radar systems [4</w:t>
-      </w:r>
-      <w:proofErr w:type="gramStart"/>
-      <w:r>
-        <w:t>] .</w:t>
-      </w:r>
-      <w:proofErr w:type="gramEnd"/>
-      <w:r>
-        <w:t xml:space="preserve"> The standard breath frequencies of human beings are 0.2–0.33 Hz</w:t>
+        <w:t>Thus, the detection of the breath is crucial for vital sign monitoring. The breath rate is detectable using contact-based and remote sensors such as electrocardiography, strain-based sensors, photoplethysmography, and radar systems [4] . The standard breath frequencies of human beings are 0.2–0.33 Hz</w:t>
       </w:r>
     </w:p>
     <w:p>
@@ -1615,21 +1556,7 @@
         <w:rPr>
           <w:lang w:val="en-US"/>
         </w:rPr>
-        <w:t xml:space="preserve">Movement of the human chest while breathing </w:t>
-      </w:r>
-      <w:proofErr w:type="gramStart"/>
-      <w:r>
-        <w:rPr>
-          <w:lang w:val="en-US"/>
-        </w:rPr>
-        <w:t>are</w:t>
-      </w:r>
-      <w:proofErr w:type="gramEnd"/>
-      <w:r>
-        <w:rPr>
-          <w:lang w:val="en-US"/>
-        </w:rPr>
-        <w:t xml:space="preserve"> sensible by UWB radar systems</w:t>
+        <w:t>Movement of the human chest while breathing are sensible by UWB radar systems</w:t>
       </w:r>
     </w:p>
     <w:p>
@@ -1647,21 +1574,7 @@
         <w:rPr>
           <w:lang w:val="en-US"/>
         </w:rPr>
-        <w:t xml:space="preserve">Machine learning algorithms </w:t>
-      </w:r>
-      <w:proofErr w:type="gramStart"/>
-      <w:r>
-        <w:rPr>
-          <w:lang w:val="en-US"/>
-        </w:rPr>
-        <w:t>assist</w:t>
-      </w:r>
-      <w:proofErr w:type="gramEnd"/>
-      <w:r>
-        <w:rPr>
-          <w:lang w:val="en-US"/>
-        </w:rPr>
-        <w:t xml:space="preserve"> in accurate readings of human vital signs</w:t>
+        <w:t>Machine learning algorithms assist in accurate readings of human vital signs</w:t>
       </w:r>
     </w:p>
     <w:p>
@@ -1708,7 +1621,7 @@
           <w:lang w:val="en-US"/>
         </w:rPr>
       </w:pPr>
-      <w:hyperlink r:id="rId23" w:history="1">
+      <w:hyperlink r:id="rId24" w:history="1">
         <w:r>
           <w:rPr>
             <w:rStyle w:val="Hyperlink"/>
@@ -1744,41 +1657,145 @@
         <w:rPr>
           <w:lang w:val="en-US"/>
         </w:rPr>
-        <w:t xml:space="preserve">vs algorithm when it comes to analyzing the </w:t>
-      </w:r>
-      <w:proofErr w:type="gramStart"/>
-      <w:r>
-        <w:rPr>
-          <w:lang w:val="en-US"/>
-        </w:rPr>
-        <w:t xml:space="preserve">images </w:t>
-      </w:r>
-      <w:r>
-        <w:rPr>
-          <w:lang w:val="en-US"/>
-        </w:rPr>
-        <w:t>,</w:t>
-      </w:r>
-      <w:proofErr w:type="gramEnd"/>
+        <w:t xml:space="preserve">vs algorithm when it comes to analyzing the images </w:t>
+      </w:r>
+      <w:r>
+        <w:rPr>
+          <w:lang w:val="en-US"/>
+        </w:rPr>
+        <w:t>, alogirthm takes less than a second to process an image</w:t>
+      </w:r>
+    </w:p>
+    <w:p>
+      <w:pPr>
+        <w:pStyle w:val="ListParagraph"/>
+        <w:numPr>
+          <w:ilvl w:val="0"/>
+          <w:numId w:val="7"/>
+        </w:numPr>
+        <w:rPr>
+          <w:lang w:val="en-US"/>
+        </w:rPr>
+      </w:pPr>
+      <w:r>
+        <w:rPr>
+          <w:lang w:val="en-US"/>
+        </w:rPr>
+        <w:t xml:space="preserve">Used to find lost people on large </w:t>
+      </w:r>
+      <w:r>
+        <w:rPr>
+          <w:lang w:val="en-US"/>
+        </w:rPr>
+        <w:t xml:space="preserve">terrain – they provided a list of categories </w:t>
+      </w:r>
+      <w:r>
+        <w:rPr>
+          <w:lang w:val="en-US"/>
+        </w:rPr>
+        <w:t>such</w:t>
+      </w:r>
+      <w:r>
+        <w:rPr>
+          <w:lang w:val="en-US"/>
+        </w:rPr>
+        <w:t xml:space="preserve"> as age, mental state, </w:t>
+      </w:r>
+      <w:r>
+        <w:rPr>
+          <w:lang w:val="en-US"/>
+        </w:rPr>
+        <w:t xml:space="preserve">what hunters, climbers, ordinary people where, older demented people. These are factors that need to be accounted for when searching for someone. </w:t>
+      </w:r>
+      <w:r>
+        <w:rPr>
+          <w:lang w:val="en-US"/>
+        </w:rPr>
+        <w:t xml:space="preserve">So the algorithm has to be trained accordingly </w:t>
+      </w:r>
+    </w:p>
+    <w:p>
+      <w:pPr>
+        <w:pStyle w:val="ListParagraph"/>
+        <w:numPr>
+          <w:ilvl w:val="0"/>
+          <w:numId w:val="7"/>
+        </w:numPr>
+        <w:rPr>
+          <w:lang w:val="en-US"/>
+        </w:rPr>
+      </w:pPr>
+      <w:r>
+        <w:rPr>
+          <w:lang w:val="en-US"/>
+        </w:rPr>
+        <w:t xml:space="preserve">Algorithm struggles when the persons clothes are </w:t>
+      </w:r>
+      <w:r>
+        <w:rPr>
+          <w:lang w:val="en-US"/>
+        </w:rPr>
+        <w:t xml:space="preserve">blended with the environment </w:t>
+      </w:r>
+    </w:p>
+    <w:p>
+      <w:pPr>
+        <w:pStyle w:val="ListParagraph"/>
+        <w:numPr>
+          <w:ilvl w:val="0"/>
+          <w:numId w:val="7"/>
+        </w:numPr>
+        <w:rPr>
+          <w:lang w:val="en-US"/>
+        </w:rPr>
+      </w:pPr>
+      <w:r>
+        <w:rPr>
+          <w:lang w:val="en-US"/>
+        </w:rPr>
+        <w:t>Training models so that the UAVs are able to detect people</w:t>
+      </w:r>
+      <w:r>
+        <w:rPr>
+          <w:lang w:val="en-US"/>
+        </w:rPr>
+        <w:t>, using CNN</w:t>
+      </w:r>
+    </w:p>
+    <w:p>
+      <w:pPr>
+        <w:pStyle w:val="ListParagraph"/>
+        <w:numPr>
+          <w:ilvl w:val="0"/>
+          <w:numId w:val="7"/>
+        </w:numPr>
+        <w:rPr>
+          <w:lang w:val="en-US"/>
+        </w:rPr>
+      </w:pPr>
+      <w:r>
+        <w:rPr>
+          <w:lang w:val="en-US"/>
+        </w:rPr>
+        <w:t xml:space="preserve">The </w:t>
+      </w:r>
+      <w:r>
+        <w:rPr>
+          <w:lang w:val="en-US"/>
+        </w:rPr>
+        <w:t>algorithm</w:t>
+      </w:r>
       <w:r>
         <w:rPr>
           <w:lang w:val="en-US"/>
         </w:rPr>
         <w:t xml:space="preserve"> </w:t>
       </w:r>
-      <w:proofErr w:type="spellStart"/>
-      <w:r>
-        <w:rPr>
-          <w:lang w:val="en-US"/>
-        </w:rPr>
-        <w:t>alogirthm</w:t>
-      </w:r>
-      <w:proofErr w:type="spellEnd"/>
-      <w:r>
-        <w:rPr>
-          <w:lang w:val="en-US"/>
-        </w:rPr>
-        <w:t xml:space="preserve"> takes less than a second to process an image</w:t>
+      <w:r>
+        <w:rPr>
+          <w:lang w:val="en-US"/>
+        </w:rPr>
+        <w:t xml:space="preserve">gave better results than the observer. And the use and combinations of observer and algorithm assisted in false positives. </w:t>
       </w:r>
     </w:p>
     <w:p>
@@ -1796,59 +1813,34 @@
         <w:rPr>
           <w:lang w:val="en-US"/>
         </w:rPr>
-        <w:t xml:space="preserve">Used to find lost people on large </w:t>
-      </w:r>
-      <w:r>
-        <w:rPr>
-          <w:lang w:val="en-US"/>
-        </w:rPr>
-        <w:t xml:space="preserve">terrain – they provided a list of categories </w:t>
-      </w:r>
-      <w:r>
-        <w:rPr>
-          <w:lang w:val="en-US"/>
-        </w:rPr>
-        <w:t>such</w:t>
-      </w:r>
-      <w:r>
-        <w:rPr>
-          <w:lang w:val="en-US"/>
-        </w:rPr>
-        <w:t xml:space="preserve"> as age, mental state, </w:t>
-      </w:r>
-      <w:r>
-        <w:rPr>
-          <w:lang w:val="en-US"/>
-        </w:rPr>
-        <w:t xml:space="preserve">what hunters, climbers, ordinary people where, older demented people. These are factors that need to be accounted for when searching for someone. </w:t>
-      </w:r>
-      <w:proofErr w:type="gramStart"/>
-      <w:r>
-        <w:rPr>
-          <w:lang w:val="en-US"/>
-        </w:rPr>
-        <w:t>So</w:t>
-      </w:r>
-      <w:proofErr w:type="gramEnd"/>
-      <w:r>
-        <w:rPr>
-          <w:lang w:val="en-US"/>
-        </w:rPr>
-        <w:t xml:space="preserve"> the algorithm </w:t>
-      </w:r>
-      <w:proofErr w:type="gramStart"/>
-      <w:r>
-        <w:rPr>
-          <w:lang w:val="en-US"/>
-        </w:rPr>
-        <w:t>has to</w:t>
-      </w:r>
-      <w:proofErr w:type="gramEnd"/>
-      <w:r>
-        <w:rPr>
-          <w:lang w:val="en-US"/>
-        </w:rPr>
-        <w:t xml:space="preserve"> be trained accordingly </w:t>
+        <w:t xml:space="preserve">Further research is for real time </w:t>
+      </w:r>
+      <w:r>
+        <w:rPr>
+          <w:lang w:val="en-US"/>
+        </w:rPr>
+        <w:t>analyze</w:t>
+      </w:r>
+      <w:r>
+        <w:rPr>
+          <w:lang w:val="en-US"/>
+        </w:rPr>
+        <w:t xml:space="preserve"> – so </w:t>
+      </w:r>
+      <w:r>
+        <w:rPr>
+          <w:lang w:val="en-US"/>
+        </w:rPr>
+        <w:t>performed</w:t>
+      </w:r>
+      <w:r>
+        <w:rPr>
+          <w:lang w:val="en-US"/>
+        </w:rPr>
+        <w:t xml:space="preserve"> on UAV and </w:t>
+      </w:r>
+      <w:r>
+        <w:t>parts of the image detected as regions of interest can be transmitted in real time to the operator for inspection. This would significantly increase search efficiency.</w:t>
       </w:r>
     </w:p>
     <w:p>
@@ -1866,89 +1858,31 @@
         <w:rPr>
           <w:lang w:val="en-US"/>
         </w:rPr>
-        <w:t xml:space="preserve">Algorithm struggles when the </w:t>
-      </w:r>
-      <w:proofErr w:type="gramStart"/>
-      <w:r>
-        <w:rPr>
-          <w:lang w:val="en-US"/>
-        </w:rPr>
-        <w:t>persons</w:t>
-      </w:r>
-      <w:proofErr w:type="gramEnd"/>
-      <w:r>
-        <w:rPr>
-          <w:lang w:val="en-US"/>
-        </w:rPr>
-        <w:t xml:space="preserve"> clothes are </w:t>
-      </w:r>
-      <w:r>
-        <w:rPr>
-          <w:lang w:val="en-US"/>
-        </w:rPr>
-        <w:t xml:space="preserve">blended with the environment </w:t>
-      </w:r>
-    </w:p>
-    <w:p>
-      <w:pPr>
-        <w:pStyle w:val="ListParagraph"/>
-        <w:numPr>
-          <w:ilvl w:val="0"/>
-          <w:numId w:val="7"/>
-        </w:numPr>
-        <w:rPr>
-          <w:lang w:val="en-US"/>
-        </w:rPr>
-      </w:pPr>
-      <w:r>
-        <w:rPr>
-          <w:lang w:val="en-US"/>
-        </w:rPr>
-        <w:t xml:space="preserve">Training models so that the UAVs </w:t>
-      </w:r>
-      <w:proofErr w:type="gramStart"/>
-      <w:r>
-        <w:rPr>
-          <w:lang w:val="en-US"/>
-        </w:rPr>
-        <w:t>are able to</w:t>
-      </w:r>
-      <w:proofErr w:type="gramEnd"/>
-      <w:r>
-        <w:rPr>
-          <w:lang w:val="en-US"/>
-        </w:rPr>
-        <w:t xml:space="preserve"> detect people</w:t>
-      </w:r>
-      <w:r>
-        <w:rPr>
-          <w:lang w:val="en-US"/>
-        </w:rPr>
-        <w:t>, using CNN</w:t>
-      </w:r>
-    </w:p>
-    <w:p>
-      <w:pPr>
-        <w:pStyle w:val="ListParagraph"/>
-        <w:numPr>
-          <w:ilvl w:val="0"/>
-          <w:numId w:val="7"/>
-        </w:numPr>
-        <w:rPr>
-          <w:lang w:val="en-US"/>
-        </w:rPr>
-      </w:pPr>
-      <w:r>
-        <w:rPr>
-          <w:lang w:val="en-US"/>
-        </w:rPr>
-        <w:t xml:space="preserve">The </w:t>
-      </w:r>
-      <w:r>
-        <w:rPr>
-          <w:lang w:val="en-US"/>
-        </w:rPr>
-        <w:t>algorithm</w:t>
+        <w:t xml:space="preserve">This case can be converted to having the robot being completely offline when signal is lost and it </w:t>
+      </w:r>
+      <w:r>
+        <w:rPr>
+          <w:lang w:val="en-US"/>
+        </w:rPr>
+        <w:t>can have</w:t>
+      </w:r>
+      <w:r>
+        <w:rPr>
+          <w:lang w:val="en-US"/>
+        </w:rPr>
+        <w:t xml:space="preserve"> the capabilities</w:t>
+      </w:r>
+      <w:r>
+        <w:rPr>
+          <w:lang w:val="en-US"/>
+        </w:rPr>
+        <w:t xml:space="preserve"> to detect a person , check vitals, and return to a spot where signal is restored to inform the </w:t>
+      </w:r>
+      <w:r>
+        <w:rPr>
+          <w:lang w:val="en-US"/>
+        </w:rPr>
+        <w:t>station</w:t>
       </w:r>
       <w:r>
         <w:rPr>
@@ -1956,119 +1890,6 @@
         </w:rPr>
         <w:t xml:space="preserve"> </w:t>
       </w:r>
-      <w:r>
-        <w:rPr>
-          <w:lang w:val="en-US"/>
-        </w:rPr>
-        <w:t xml:space="preserve">gave better results than the observer. And the use and combinations of observer and algorithm assisted in false positives. </w:t>
-      </w:r>
-    </w:p>
-    <w:p>
-      <w:pPr>
-        <w:pStyle w:val="ListParagraph"/>
-        <w:numPr>
-          <w:ilvl w:val="0"/>
-          <w:numId w:val="7"/>
-        </w:numPr>
-        <w:rPr>
-          <w:lang w:val="en-US"/>
-        </w:rPr>
-      </w:pPr>
-      <w:r>
-        <w:rPr>
-          <w:lang w:val="en-US"/>
-        </w:rPr>
-        <w:t xml:space="preserve">Further research is for real time </w:t>
-      </w:r>
-      <w:r>
-        <w:rPr>
-          <w:lang w:val="en-US"/>
-        </w:rPr>
-        <w:t>analyze</w:t>
-      </w:r>
-      <w:r>
-        <w:rPr>
-          <w:lang w:val="en-US"/>
-        </w:rPr>
-        <w:t xml:space="preserve"> – so </w:t>
-      </w:r>
-      <w:r>
-        <w:rPr>
-          <w:lang w:val="en-US"/>
-        </w:rPr>
-        <w:t>performed</w:t>
-      </w:r>
-      <w:r>
-        <w:rPr>
-          <w:lang w:val="en-US"/>
-        </w:rPr>
-        <w:t xml:space="preserve"> on UAV and </w:t>
-      </w:r>
-      <w:r>
-        <w:t>parts of the image detected as regions of interest can be transmitted in real time to the operator for inspection. This would significantly increase search efficiency.</w:t>
-      </w:r>
-    </w:p>
-    <w:p>
-      <w:pPr>
-        <w:pStyle w:val="ListParagraph"/>
-        <w:numPr>
-          <w:ilvl w:val="0"/>
-          <w:numId w:val="7"/>
-        </w:numPr>
-        <w:rPr>
-          <w:lang w:val="en-US"/>
-        </w:rPr>
-      </w:pPr>
-      <w:r>
-        <w:rPr>
-          <w:lang w:val="en-US"/>
-        </w:rPr>
-        <w:t xml:space="preserve">This case can be converted to having the robot being completely offline when signal is lost and it </w:t>
-      </w:r>
-      <w:r>
-        <w:rPr>
-          <w:lang w:val="en-US"/>
-        </w:rPr>
-        <w:t>can have</w:t>
-      </w:r>
-      <w:r>
-        <w:rPr>
-          <w:lang w:val="en-US"/>
-        </w:rPr>
-        <w:t xml:space="preserve"> the capabilities</w:t>
-      </w:r>
-      <w:r>
-        <w:rPr>
-          <w:lang w:val="en-US"/>
-        </w:rPr>
-        <w:t xml:space="preserve"> to detect a </w:t>
-      </w:r>
-      <w:proofErr w:type="gramStart"/>
-      <w:r>
-        <w:rPr>
-          <w:lang w:val="en-US"/>
-        </w:rPr>
-        <w:t>person ,</w:t>
-      </w:r>
-      <w:proofErr w:type="gramEnd"/>
-      <w:r>
-        <w:rPr>
-          <w:lang w:val="en-US"/>
-        </w:rPr>
-        <w:t xml:space="preserve"> check vitals, and return to a spot where signal is restored to inform the </w:t>
-      </w:r>
-      <w:r>
-        <w:rPr>
-          <w:lang w:val="en-US"/>
-        </w:rPr>
-        <w:t>station</w:t>
-      </w:r>
-      <w:r>
-        <w:rPr>
-          <w:lang w:val="en-US"/>
-        </w:rPr>
-        <w:t xml:space="preserve"> </w:t>
-      </w:r>
     </w:p>
     <w:p>
       <w:pPr>
@@ -2134,7 +1955,7 @@
           <w:lang w:val="en-US"/>
         </w:rPr>
       </w:pPr>
-      <w:hyperlink r:id="rId24" w:history="1">
+      <w:hyperlink r:id="rId25" w:history="1">
         <w:r>
           <w:rPr>
             <w:rStyle w:val="Hyperlink"/>

</xml_diff>

<commit_message>
mutiple attempts to fix process, events and durative actions
</commit_message>
<xml_diff>
--- a/Notes-Assignment.docx
+++ b/Notes-Assignment.docx
@@ -35,7 +35,21 @@
         <w:rPr>
           <w:lang w:val="en-US"/>
         </w:rPr>
-        <w:t xml:space="preserve">With regards to how the predicates in the visualizer become true/false. With respect to microphones. So we can use </w:t>
+        <w:t xml:space="preserve">With regards to how the predicates in the visualizer become true/false. With respect to microphones. </w:t>
+      </w:r>
+      <w:proofErr w:type="gramStart"/>
+      <w:r>
+        <w:rPr>
+          <w:lang w:val="en-US"/>
+        </w:rPr>
+        <w:t>So</w:t>
+      </w:r>
+      <w:proofErr w:type="gramEnd"/>
+      <w:r>
+        <w:rPr>
+          <w:lang w:val="en-US"/>
+        </w:rPr>
+        <w:t xml:space="preserve"> we can use </w:t>
       </w:r>
       <w:r>
         <w:rPr>
@@ -47,7 +61,21 @@
         <w:rPr>
           <w:lang w:val="en-US"/>
         </w:rPr>
-        <w:t xml:space="preserve">uses the de-dopplerized signals (which </w:t>
+        <w:t>uses the de-</w:t>
+      </w:r>
+      <w:proofErr w:type="spellStart"/>
+      <w:r>
+        <w:rPr>
+          <w:lang w:val="en-US"/>
+        </w:rPr>
+        <w:t>dopplerized</w:t>
+      </w:r>
+      <w:proofErr w:type="spellEnd"/>
+      <w:r>
+        <w:rPr>
+          <w:lang w:val="en-US"/>
+        </w:rPr>
+        <w:t xml:space="preserve"> signals (which </w:t>
       </w:r>
       <w:r>
         <w:t xml:space="preserve">refers to the processes, algorithms, and techniques used to </w:t>
@@ -77,8 +105,13 @@
       </w:r>
     </w:p>
     <w:p>
-      <w:r>
-        <w:t xml:space="preserve">So </w:t>
+      <w:proofErr w:type="gramStart"/>
+      <w:r>
+        <w:t>So</w:t>
+      </w:r>
+      <w:proofErr w:type="gramEnd"/>
+      <w:r>
+        <w:t xml:space="preserve"> </w:t>
       </w:r>
       <w:r>
         <w:t xml:space="preserve">using the </w:t>
@@ -104,10 +137,31 @@
     </w:p>
     <w:p>
       <w:r>
-        <w:t xml:space="preserve">It also takes into account the echos of sounds and warps that into calculations which </w:t>
-      </w:r>
-      <w:r>
-        <w:t xml:space="preserve">diverege the system </w:t>
+        <w:t xml:space="preserve">It also </w:t>
+      </w:r>
+      <w:proofErr w:type="gramStart"/>
+      <w:r>
+        <w:t>takes into account</w:t>
+      </w:r>
+      <w:proofErr w:type="gramEnd"/>
+      <w:r>
+        <w:t xml:space="preserve"> the </w:t>
+      </w:r>
+      <w:proofErr w:type="spellStart"/>
+      <w:r>
+        <w:t>echos</w:t>
+      </w:r>
+      <w:proofErr w:type="spellEnd"/>
+      <w:r>
+        <w:t xml:space="preserve"> of sounds and warps that into calculations which </w:t>
+      </w:r>
+      <w:proofErr w:type="spellStart"/>
+      <w:r>
+        <w:t>diverege</w:t>
+      </w:r>
+      <w:proofErr w:type="spellEnd"/>
+      <w:r>
+        <w:t xml:space="preserve"> the system </w:t>
       </w:r>
     </w:p>
     <w:p>
@@ -268,11 +322,19 @@
           <w:lang w:val="en-US"/>
         </w:rPr>
       </w:pPr>
-      <w:r>
-        <w:rPr>
-          <w:lang w:val="en-US"/>
-        </w:rPr>
-        <w:t xml:space="preserve">Tries to balance the noise between the </w:t>
+      <w:proofErr w:type="gramStart"/>
+      <w:r>
+        <w:rPr>
+          <w:lang w:val="en-US"/>
+        </w:rPr>
+        <w:t>Tries</w:t>
+      </w:r>
+      <w:proofErr w:type="gramEnd"/>
+      <w:r>
+        <w:rPr>
+          <w:lang w:val="en-US"/>
+        </w:rPr>
+        <w:t xml:space="preserve"> to balance the noise between the </w:t>
       </w:r>
       <w:r>
         <w:rPr>
@@ -362,7 +424,21 @@
         <w:rPr>
           <w:lang w:val="en-US"/>
         </w:rPr>
-        <w:t xml:space="preserve">robot generate roughly the same dB . However, as the robot approaches the generated noise, the dB from the </w:t>
+        <w:t xml:space="preserve">robot generate roughly the same </w:t>
+      </w:r>
+      <w:proofErr w:type="gramStart"/>
+      <w:r>
+        <w:rPr>
+          <w:lang w:val="en-US"/>
+        </w:rPr>
+        <w:t>dB .</w:t>
+      </w:r>
+      <w:proofErr w:type="gramEnd"/>
+      <w:r>
+        <w:rPr>
+          <w:lang w:val="en-US"/>
+        </w:rPr>
+        <w:t xml:space="preserve"> However, as the robot approaches the generated noise, the dB from the </w:t>
       </w:r>
       <w:r>
         <w:rPr>
@@ -370,11 +446,19 @@
         </w:rPr>
         <w:t xml:space="preserve">object </w:t>
       </w:r>
-      <w:r>
-        <w:rPr>
-          <w:lang w:val="en-US"/>
-        </w:rPr>
-        <w:t>grow exponentially</w:t>
+      <w:proofErr w:type="gramStart"/>
+      <w:r>
+        <w:rPr>
+          <w:lang w:val="en-US"/>
+        </w:rPr>
+        <w:t>grow</w:t>
+      </w:r>
+      <w:proofErr w:type="gramEnd"/>
+      <w:r>
+        <w:rPr>
+          <w:lang w:val="en-US"/>
+        </w:rPr>
+        <w:t xml:space="preserve"> exponentially</w:t>
       </w:r>
       <w:r>
         <w:rPr>
@@ -437,7 +521,21 @@
           <w:rPr>
             <w:rStyle w:val="Hyperlink"/>
           </w:rPr>
-          <w:t>Sound Source Localization and Detection Methods | Encyclopedia MDPI</w:t>
+          <w:t xml:space="preserve">Sound Source Localization and Detection Methods | </w:t>
+        </w:r>
+        <w:proofErr w:type="spellStart"/>
+        <w:r>
+          <w:rPr>
+            <w:rStyle w:val="Hyperlink"/>
+          </w:rPr>
+          <w:t>Encyclopedia</w:t>
+        </w:r>
+        <w:proofErr w:type="spellEnd"/>
+        <w:r>
+          <w:rPr>
+            <w:rStyle w:val="Hyperlink"/>
+          </w:rPr>
+          <w:t xml:space="preserve"> MDPI</w:t>
         </w:r>
       </w:hyperlink>
     </w:p>
@@ -489,7 +587,15 @@
         <w:t>]</w:t>
       </w:r>
       <w:r>
-        <w:t>. Localizing a moving sound source using the TDoA method is a problem due to the Doppler effect</w:t>
+        <w:t xml:space="preserve">. Localizing a moving sound source using the </w:t>
+      </w:r>
+      <w:proofErr w:type="spellStart"/>
+      <w:r>
+        <w:t>TDoA</w:t>
+      </w:r>
+      <w:proofErr w:type="spellEnd"/>
+      <w:r>
+        <w:t xml:space="preserve"> method is a problem due to the Doppler effect</w:t>
       </w:r>
     </w:p>
     <w:p>
@@ -530,8 +636,16 @@
           <w:rPr>
             <w:rStyle w:val="Hyperlink"/>
           </w:rPr>
-          <w:t>Firefighter Search and Rescue Techniques | BlowHard</w:t>
+          <w:t xml:space="preserve">Firefighter Search and Rescue Techniques | </w:t>
         </w:r>
+        <w:proofErr w:type="spellStart"/>
+        <w:r>
+          <w:rPr>
+            <w:rStyle w:val="Hyperlink"/>
+          </w:rPr>
+          <w:t>BlowHard</w:t>
+        </w:r>
+        <w:proofErr w:type="spellEnd"/>
       </w:hyperlink>
     </w:p>
     <w:p>
@@ -776,8 +890,30 @@
         <w:rPr>
           <w:lang w:val="en-US"/>
         </w:rPr>
-        <w:t>How the technology actually works</w:t>
-      </w:r>
+        <w:t xml:space="preserve">How </w:t>
+      </w:r>
+      <w:proofErr w:type="gramStart"/>
+      <w:r>
+        <w:rPr>
+          <w:lang w:val="en-US"/>
+        </w:rPr>
+        <w:t>the technology</w:t>
+      </w:r>
+      <w:proofErr w:type="gramEnd"/>
+      <w:r>
+        <w:rPr>
+          <w:lang w:val="en-US"/>
+        </w:rPr>
+        <w:t xml:space="preserve"> </w:t>
+      </w:r>
+      <w:proofErr w:type="gramStart"/>
+      <w:r>
+        <w:rPr>
+          <w:lang w:val="en-US"/>
+        </w:rPr>
+        <w:t>actually works</w:t>
+      </w:r>
+      <w:proofErr w:type="gramEnd"/>
     </w:p>
     <w:p>
       <w:pPr>
@@ -870,7 +1006,21 @@
         <w:rPr>
           <w:lang w:val="en-US"/>
         </w:rPr>
-        <w:t xml:space="preserve">Don’t remove rubble to quickly </w:t>
+        <w:t xml:space="preserve">Don’t remove rubble </w:t>
+      </w:r>
+      <w:proofErr w:type="gramStart"/>
+      <w:r>
+        <w:rPr>
+          <w:lang w:val="en-US"/>
+        </w:rPr>
+        <w:t>to</w:t>
+      </w:r>
+      <w:proofErr w:type="gramEnd"/>
+      <w:r>
+        <w:rPr>
+          <w:lang w:val="en-US"/>
+        </w:rPr>
+        <w:t xml:space="preserve"> quickly </w:t>
       </w:r>
     </w:p>
     <w:p>
@@ -918,7 +1068,21 @@
         <w:rPr>
           <w:lang w:val="en-US"/>
         </w:rPr>
-        <w:t>debris to move again which causes harm to the rescuer and the victims</w:t>
+        <w:t xml:space="preserve">debris to move again which causes harm to the </w:t>
+      </w:r>
+      <w:proofErr w:type="gramStart"/>
+      <w:r>
+        <w:rPr>
+          <w:lang w:val="en-US"/>
+        </w:rPr>
+        <w:t>rescuer</w:t>
+      </w:r>
+      <w:proofErr w:type="gramEnd"/>
+      <w:r>
+        <w:rPr>
+          <w:lang w:val="en-US"/>
+        </w:rPr>
+        <w:t xml:space="preserve"> and the victims</w:t>
       </w:r>
     </w:p>
     <w:p>
@@ -952,7 +1116,21 @@
           <w:rPr>
             <w:rStyle w:val="Hyperlink"/>
           </w:rPr>
-          <w:t>All About Rescue Robots | Amprius Technologies</w:t>
+          <w:t xml:space="preserve">All About Rescue Robots | </w:t>
+        </w:r>
+        <w:proofErr w:type="spellStart"/>
+        <w:r>
+          <w:rPr>
+            <w:rStyle w:val="Hyperlink"/>
+          </w:rPr>
+          <w:t>Amprius</w:t>
+        </w:r>
+        <w:proofErr w:type="spellEnd"/>
+        <w:r>
+          <w:rPr>
+            <w:rStyle w:val="Hyperlink"/>
+          </w:rPr>
+          <w:t xml:space="preserve"> Technologies</w:t>
         </w:r>
       </w:hyperlink>
     </w:p>
@@ -967,7 +1145,21 @@
           <w:rPr>
             <w:rStyle w:val="Hyperlink"/>
           </w:rPr>
-          <w:t>How KNF Helped To Develop a New Earthquake Rescue Robot | KNF</w:t>
+          <w:t xml:space="preserve">How KNF Helped </w:t>
+        </w:r>
+        <w:proofErr w:type="gramStart"/>
+        <w:r>
+          <w:rPr>
+            <w:rStyle w:val="Hyperlink"/>
+          </w:rPr>
+          <w:t>To</w:t>
+        </w:r>
+        <w:proofErr w:type="gramEnd"/>
+        <w:r>
+          <w:rPr>
+            <w:rStyle w:val="Hyperlink"/>
+          </w:rPr>
+          <w:t xml:space="preserve"> Develop a New Earthquake Rescue Robot | KNF</w:t>
         </w:r>
       </w:hyperlink>
     </w:p>
@@ -1080,10 +1272,18 @@
         <w:t>after snakes, which can glide through rubble and debris after earthquakes.</w:t>
       </w:r>
       <w:r>
-        <w:t xml:space="preserve"> – Developed by ETH using </w:t>
-      </w:r>
-      <w:r>
-        <w:t> long and twisted textile tube and a head that carries pneumatic steering actuators,</w:t>
+        <w:t xml:space="preserve"> – Developed by ETH </w:t>
+      </w:r>
+      <w:proofErr w:type="gramStart"/>
+      <w:r>
+        <w:t xml:space="preserve">using </w:t>
+      </w:r>
+      <w:r>
+        <w:t> long</w:t>
+      </w:r>
+      <w:proofErr w:type="gramEnd"/>
+      <w:r>
+        <w:t xml:space="preserve"> and twisted textile tube and a head that carries pneumatic steering actuators,</w:t>
       </w:r>
       <w:r>
         <w:t xml:space="preserve"> v</w:t>
@@ -1128,21 +1328,37 @@
         </w:rPr>
       </w:pPr>
       <w:hyperlink r:id="rId19" w:tgtFrame="_blank" w:history="1">
+        <w:proofErr w:type="spellStart"/>
         <w:r>
           <w:rPr>
             <w:rStyle w:val="Hyperlink"/>
           </w:rPr>
-          <w:t>Hyrodnalix’s Emergency Integrated Lifesaving Lanyard</w:t>
+          <w:t>Hyrodnalix’s</w:t>
+        </w:r>
+        <w:proofErr w:type="spellEnd"/>
+        <w:r>
+          <w:rPr>
+            <w:rStyle w:val="Hyperlink"/>
+          </w:rPr>
+          <w:t xml:space="preserve"> Emergency Integrated Lifesaving Lanyard</w:t>
         </w:r>
       </w:hyperlink>
       <w:r>
-        <w:t> (EMILY) </w:t>
+        <w:t> (</w:t>
+      </w:r>
+      <w:proofErr w:type="gramStart"/>
+      <w:r>
+        <w:t>EMILY) </w:t>
       </w:r>
       <w:r>
         <w:t xml:space="preserve"> </w:t>
       </w:r>
       <w:r>
-        <w:t xml:space="preserve">- </w:t>
+        <w:t>-</w:t>
+      </w:r>
+      <w:proofErr w:type="gramEnd"/>
+      <w:r>
+        <w:t xml:space="preserve"> </w:t>
       </w:r>
       <w:r>
         <w:t>air into the water and drive it to people who need rescuing</w:t>
@@ -1200,7 +1416,21 @@
         <w:rPr>
           <w:lang w:val="en-US"/>
         </w:rPr>
-        <w:t>Lack durability for long term use in disasters – needs to have a lot of maintance and access to maintenance and places need to have the correct repair kit</w:t>
+        <w:t xml:space="preserve">Lack durability for long term use in disasters – needs to have a lot of </w:t>
+      </w:r>
+      <w:proofErr w:type="spellStart"/>
+      <w:r>
+        <w:rPr>
+          <w:lang w:val="en-US"/>
+        </w:rPr>
+        <w:t>maintance</w:t>
+      </w:r>
+      <w:proofErr w:type="spellEnd"/>
+      <w:r>
+        <w:rPr>
+          <w:lang w:val="en-US"/>
+        </w:rPr>
+        <w:t xml:space="preserve"> and access to maintenance and places need to have the correct repair kit</w:t>
       </w:r>
     </w:p>
     <w:p>
@@ -1242,7 +1472,21 @@
         <w:rPr>
           <w:lang w:val="en-US"/>
         </w:rPr>
-        <w:t>Expensive to develop , and maintain – particularly in lower income countries where this type of technology is not feasible</w:t>
+        <w:t xml:space="preserve">Expensive to </w:t>
+      </w:r>
+      <w:proofErr w:type="gramStart"/>
+      <w:r>
+        <w:rPr>
+          <w:lang w:val="en-US"/>
+        </w:rPr>
+        <w:t>develop ,</w:t>
+      </w:r>
+      <w:proofErr w:type="gramEnd"/>
+      <w:r>
+        <w:rPr>
+          <w:lang w:val="en-US"/>
+        </w:rPr>
+        <w:t xml:space="preserve"> and maintain – particularly in lower income countries where this type of technology is not feasible</w:t>
       </w:r>
       <w:r>
         <w:rPr>
@@ -1357,7 +1601,21 @@
           <w:rPr>
             <w:rStyle w:val="Hyperlink"/>
           </w:rPr>
-          <w:t>How Much Blood Loss is Fatal? The Critical Thresholds of Hemorrhagic S– MED-TAC International Corp.</w:t>
+          <w:t xml:space="preserve">How Much Blood Loss is Fatal? The Critical Thresholds of </w:t>
+        </w:r>
+        <w:proofErr w:type="spellStart"/>
+        <w:r>
+          <w:rPr>
+            <w:rStyle w:val="Hyperlink"/>
+          </w:rPr>
+          <w:t>Hemorrhagic</w:t>
+        </w:r>
+        <w:proofErr w:type="spellEnd"/>
+        <w:r>
+          <w:rPr>
+            <w:rStyle w:val="Hyperlink"/>
+          </w:rPr>
+          <w:t xml:space="preserve"> S– MED-TAC International Corp.</w:t>
         </w:r>
       </w:hyperlink>
     </w:p>
@@ -1385,7 +1643,35 @@
           <w:rPr>
             <w:rStyle w:val="Hyperlink"/>
           </w:rPr>
-          <w:t>Contactless Vital Signs Monitoring From Videos Recorded With Digital Cameras: An Overview - PMC</w:t>
+          <w:t xml:space="preserve">Contactless Vital Signs Monitoring </w:t>
+        </w:r>
+        <w:proofErr w:type="gramStart"/>
+        <w:r>
+          <w:rPr>
+            <w:rStyle w:val="Hyperlink"/>
+          </w:rPr>
+          <w:t>From</w:t>
+        </w:r>
+        <w:proofErr w:type="gramEnd"/>
+        <w:r>
+          <w:rPr>
+            <w:rStyle w:val="Hyperlink"/>
+          </w:rPr>
+          <w:t xml:space="preserve"> Videos Recorded </w:t>
+        </w:r>
+        <w:proofErr w:type="gramStart"/>
+        <w:r>
+          <w:rPr>
+            <w:rStyle w:val="Hyperlink"/>
+          </w:rPr>
+          <w:t>With</w:t>
+        </w:r>
+        <w:proofErr w:type="gramEnd"/>
+        <w:r>
+          <w:rPr>
+            <w:rStyle w:val="Hyperlink"/>
+          </w:rPr>
+          <w:t xml:space="preserve"> Digital Cameras: An Overview - PMC</w:t>
         </w:r>
       </w:hyperlink>
     </w:p>
@@ -1434,7 +1720,29 @@
         <w:rPr>
           <w:lang w:val="en-US"/>
         </w:rPr>
-        <w:t xml:space="preserve"> provide a good trade off between unobtrusiveness and sensitivity to cardiorespiratory changes- </w:t>
+        <w:t xml:space="preserve"> provide a good </w:t>
+      </w:r>
+      <w:proofErr w:type="spellStart"/>
+      <w:r>
+        <w:rPr>
+          <w:lang w:val="en-US"/>
+        </w:rPr>
+        <w:t xml:space="preserve">trade </w:t>
+      </w:r>
+      <w:proofErr w:type="gramStart"/>
+      <w:r>
+        <w:rPr>
+          <w:lang w:val="en-US"/>
+        </w:rPr>
+        <w:t>off</w:t>
+      </w:r>
+      <w:proofErr w:type="spellEnd"/>
+      <w:proofErr w:type="gramEnd"/>
+      <w:r>
+        <w:rPr>
+          <w:lang w:val="en-US"/>
+        </w:rPr>
+        <w:t xml:space="preserve"> between unobtrusiveness and sensitivity to cardiorespiratory changes- </w:t>
       </w:r>
     </w:p>
     <w:p>
@@ -1538,7 +1846,15 @@
         </w:rPr>
       </w:pPr>
       <w:r>
-        <w:t>Thus, the detection of the breath is crucial for vital sign monitoring. The breath rate is detectable using contact-based and remote sensors such as electrocardiography, strain-based sensors, photoplethysmography, and radar systems [4] . The standard breath frequencies of human beings are 0.2–0.33 Hz</w:t>
+        <w:t>Thus, the detection of the breath is crucial for vital sign monitoring. The breath rate is detectable using contact-based and remote sensors such as electrocardiography, strain-based sensors, photoplethysmography, and radar systems [4</w:t>
+      </w:r>
+      <w:proofErr w:type="gramStart"/>
+      <w:r>
+        <w:t>] .</w:t>
+      </w:r>
+      <w:proofErr w:type="gramEnd"/>
+      <w:r>
+        <w:t xml:space="preserve"> The standard breath frequencies of human beings are 0.2–0.33 Hz</w:t>
       </w:r>
     </w:p>
     <w:p>
@@ -1556,7 +1872,21 @@
         <w:rPr>
           <w:lang w:val="en-US"/>
         </w:rPr>
-        <w:t>Movement of the human chest while breathing are sensible by UWB radar systems</w:t>
+        <w:t xml:space="preserve">Movement of the human chest while breathing </w:t>
+      </w:r>
+      <w:proofErr w:type="gramStart"/>
+      <w:r>
+        <w:rPr>
+          <w:lang w:val="en-US"/>
+        </w:rPr>
+        <w:t>are</w:t>
+      </w:r>
+      <w:proofErr w:type="gramEnd"/>
+      <w:r>
+        <w:rPr>
+          <w:lang w:val="en-US"/>
+        </w:rPr>
+        <w:t xml:space="preserve"> sensible by UWB radar systems</w:t>
       </w:r>
     </w:p>
     <w:p>
@@ -1574,7 +1904,21 @@
         <w:rPr>
           <w:lang w:val="en-US"/>
         </w:rPr>
-        <w:t>Machine learning algorithms assist in accurate readings of human vital signs</w:t>
+        <w:t xml:space="preserve">Machine learning algorithms </w:t>
+      </w:r>
+      <w:proofErr w:type="gramStart"/>
+      <w:r>
+        <w:rPr>
+          <w:lang w:val="en-US"/>
+        </w:rPr>
+        <w:t>assist</w:t>
+      </w:r>
+      <w:proofErr w:type="gramEnd"/>
+      <w:r>
+        <w:rPr>
+          <w:lang w:val="en-US"/>
+        </w:rPr>
+        <w:t xml:space="preserve"> in accurate readings of human vital signs</w:t>
       </w:r>
     </w:p>
     <w:p>
@@ -1657,13 +2001,41 @@
         <w:rPr>
           <w:lang w:val="en-US"/>
         </w:rPr>
-        <w:t xml:space="preserve">vs algorithm when it comes to analyzing the images </w:t>
-      </w:r>
-      <w:r>
-        <w:rPr>
-          <w:lang w:val="en-US"/>
-        </w:rPr>
-        <w:t>, alogirthm takes less than a second to process an image</w:t>
+        <w:t xml:space="preserve">vs algorithm when it comes to analyzing the </w:t>
+      </w:r>
+      <w:proofErr w:type="gramStart"/>
+      <w:r>
+        <w:rPr>
+          <w:lang w:val="en-US"/>
+        </w:rPr>
+        <w:t xml:space="preserve">images </w:t>
+      </w:r>
+      <w:r>
+        <w:rPr>
+          <w:lang w:val="en-US"/>
+        </w:rPr>
+        <w:t>,</w:t>
+      </w:r>
+      <w:proofErr w:type="gramEnd"/>
+      <w:r>
+        <w:rPr>
+          <w:lang w:val="en-US"/>
+        </w:rPr>
+        <w:t xml:space="preserve"> </w:t>
+      </w:r>
+      <w:proofErr w:type="spellStart"/>
+      <w:r>
+        <w:rPr>
+          <w:lang w:val="en-US"/>
+        </w:rPr>
+        <w:t>alogirthm</w:t>
+      </w:r>
+      <w:proofErr w:type="spellEnd"/>
+      <w:r>
+        <w:rPr>
+          <w:lang w:val="en-US"/>
+        </w:rPr>
+        <w:t xml:space="preserve"> takes less than a second to process an image</w:t>
       </w:r>
     </w:p>
     <w:p>
@@ -1707,11 +2079,33 @@
         </w:rPr>
         <w:t xml:space="preserve">what hunters, climbers, ordinary people where, older demented people. These are factors that need to be accounted for when searching for someone. </w:t>
       </w:r>
-      <w:r>
-        <w:rPr>
-          <w:lang w:val="en-US"/>
-        </w:rPr>
-        <w:t xml:space="preserve">So the algorithm has to be trained accordingly </w:t>
+      <w:proofErr w:type="gramStart"/>
+      <w:r>
+        <w:rPr>
+          <w:lang w:val="en-US"/>
+        </w:rPr>
+        <w:t>So</w:t>
+      </w:r>
+      <w:proofErr w:type="gramEnd"/>
+      <w:r>
+        <w:rPr>
+          <w:lang w:val="en-US"/>
+        </w:rPr>
+        <w:t xml:space="preserve"> the algorithm </w:t>
+      </w:r>
+      <w:proofErr w:type="gramStart"/>
+      <w:r>
+        <w:rPr>
+          <w:lang w:val="en-US"/>
+        </w:rPr>
+        <w:t>has to</w:t>
+      </w:r>
+      <w:proofErr w:type="gramEnd"/>
+      <w:r>
+        <w:rPr>
+          <w:lang w:val="en-US"/>
+        </w:rPr>
+        <w:t xml:space="preserve"> be trained accordingly </w:t>
       </w:r>
     </w:p>
     <w:p>
@@ -1729,7 +2123,21 @@
         <w:rPr>
           <w:lang w:val="en-US"/>
         </w:rPr>
-        <w:t xml:space="preserve">Algorithm struggles when the persons clothes are </w:t>
+        <w:t xml:space="preserve">Algorithm struggles when the </w:t>
+      </w:r>
+      <w:proofErr w:type="gramStart"/>
+      <w:r>
+        <w:rPr>
+          <w:lang w:val="en-US"/>
+        </w:rPr>
+        <w:t>persons</w:t>
+      </w:r>
+      <w:proofErr w:type="gramEnd"/>
+      <w:r>
+        <w:rPr>
+          <w:lang w:val="en-US"/>
+        </w:rPr>
+        <w:t xml:space="preserve"> clothes are </w:t>
       </w:r>
       <w:r>
         <w:rPr>
@@ -1753,7 +2161,21 @@
         <w:rPr>
           <w:lang w:val="en-US"/>
         </w:rPr>
-        <w:t>Training models so that the UAVs are able to detect people</w:t>
+        <w:t xml:space="preserve">Training models so that the UAVs </w:t>
+      </w:r>
+      <w:proofErr w:type="gramStart"/>
+      <w:r>
+        <w:rPr>
+          <w:lang w:val="en-US"/>
+        </w:rPr>
+        <w:t>are able to</w:t>
+      </w:r>
+      <w:proofErr w:type="gramEnd"/>
+      <w:r>
+        <w:rPr>
+          <w:lang w:val="en-US"/>
+        </w:rPr>
+        <w:t xml:space="preserve"> detect people</w:t>
       </w:r>
       <w:r>
         <w:rPr>
@@ -1876,7 +2298,21 @@
         <w:rPr>
           <w:lang w:val="en-US"/>
         </w:rPr>
-        <w:t xml:space="preserve"> to detect a person , check vitals, and return to a spot where signal is restored to inform the </w:t>
+        <w:t xml:space="preserve"> to detect a </w:t>
+      </w:r>
+      <w:proofErr w:type="gramStart"/>
+      <w:r>
+        <w:rPr>
+          <w:lang w:val="en-US"/>
+        </w:rPr>
+        <w:t>person ,</w:t>
+      </w:r>
+      <w:proofErr w:type="gramEnd"/>
+      <w:r>
+        <w:rPr>
+          <w:lang w:val="en-US"/>
+        </w:rPr>
+        <w:t xml:space="preserve"> check vitals, and return to a spot where signal is restored to inform the </w:t>
       </w:r>
       <w:r>
         <w:rPr>
@@ -1990,11 +2426,13 @@
     </w:p>
     <w:p>
       <w:pPr>
-        <w:pStyle w:val="ListParagraph"/>
-        <w:numPr>
-          <w:ilvl w:val="0"/>
-          <w:numId w:val="5"/>
-        </w:numPr>
+        <w:rPr>
+          <w:lang w:val="en-US"/>
+        </w:rPr>
+      </w:pPr>
+    </w:p>
+    <w:p>
+      <w:pPr>
         <w:rPr>
           <w:lang w:val="en-US"/>
         </w:rPr>

</xml_diff>